<commit_message>
Fix documentation, Linux script, and reproducibility
</commit_message>
<xml_diff>
--- a/Documentation/TP53_Final_Project_Documentation_NEW.docx
+++ b/Documentation/TP53_Final_Project_Documentation_NEW.docx
@@ -255,13 +255,8 @@
             <w:vAlign w:val="center"/>
           </w:tcPr>
           <w:p>
-            <w:r/>
             <w:r>
-              <w:rPr>
-                <w:b w:val="0"/>
-                <w:sz w:val="18"/>
-              </w:rPr>
-              <w:t>sequence.fasta</w:t>
+              <w:t>Data/TP53.fa (full NM_000546.6 transcript)</w:t>
             </w:r>
           </w:p>
         </w:tc>
@@ -391,7 +386,7 @@
     </w:p>
     <w:p>
       <w:r>
-        <w:t>Input: sequence.fasta</w:t>
+        <w:t>Inputs: Data/TP53.fa, Data/TP53_CDS.fa, Data/TP53_protein.fa, and Data/TP53_uniprot_reference.fa.</w:t>
       </w:r>
     </w:p>
     <w:p>
@@ -468,7 +463,7 @@
         <w:spacing w:after="40"/>
       </w:pPr>
       <w:r>
-        <w:t>Start/stop-codon based coding-region / ORF analysis</w:t>
+        <w:t>Frame-aware ORF analysis in all three forward reading frames</w:t>
       </w:r>
     </w:p>
     <w:p>
@@ -477,7 +472,7 @@
         <w:spacing w:after="40"/>
       </w:pPr>
       <w:r>
-        <w:t>Identification of the longest coding region</w:t>
+        <w:t>Identification of the longest ORF in each reading frame</w:t>
       </w:r>
     </w:p>
     <w:p>
@@ -486,7 +481,7 @@
         <w:spacing w:after="40"/>
       </w:pPr>
       <w:r>
-        <w:t>Translation of the longest coding region into protein</w:t>
+        <w:t>Translation and validation of the annotated CDS</w:t>
       </w:r>
     </w:p>
     <w:p>
@@ -513,7 +508,7 @@
         <w:spacing w:after="40"/>
       </w:pPr>
       <w:r>
-        <w:t>Protein molecular-weight calculation</w:t>
+        <w:t>Protein molecular weight calculated with Biopython ProteinAnalysis</w:t>
       </w:r>
     </w:p>
     <w:p>
@@ -531,7 +526,7 @@
         <w:spacing w:after="40"/>
       </w:pPr>
       <w:r>
-        <w:t>Estimated net charge and approximate pI using the project script</w:t>
+        <w:t>Theoretical pI and physicochemical properties calculated with Biopython ProteinAnalysis</w:t>
       </w:r>
     </w:p>
     <w:p>
@@ -590,7 +585,7 @@
     </w:p>
     <w:p>
       <w:r>
-        <w:t>Python result file: TP53_results.txt</w:t>
+        <w:t>Python outputs: Results/Python/TP53_results.txt and Plots/Python/*.png</w:t>
       </w:r>
     </w:p>
     <w:p>
@@ -838,7 +833,7 @@
         <w:spacing w:after="40"/>
       </w:pPr>
       <w:r>
-        <w:t>Command-history preservation</w:t>
+        <w:t>Original command history is preserved as an archive. Code/Linux/tp53_analysis.sh is the clean Linux reproducibility entry point. It uses absolute repository-relative resolution, regenerates deterministic local checks, and writes them to Results/Linux/Reproduced/ without overwriting the historical Linux results.</w:t>
       </w:r>
     </w:p>
     <w:p>
@@ -861,7 +856,7 @@
     </w:p>
     <w:p>
       <w:r>
-        <w:t>Environment: RStudio; R 4.6.1</w:t>
+        <w:t>Environment: RStudio; R 4.6.1 (project environment)</w:t>
       </w:r>
     </w:p>
     <w:p>
@@ -979,7 +974,7 @@
         <w:spacing w:after="40"/>
       </w:pPr>
       <w:r>
-        <w:t>Protein length across reading frames</w:t>
+        <w:t>Protein length across the three reading frames of the annotated CDS</w:t>
       </w:r>
     </w:p>
     <w:p>
@@ -988,7 +983,7 @@
         <w:spacing w:after="40"/>
       </w:pPr>
       <w:r>
-        <w:t>Longest ORF analysis</w:t>
+        <w:t>Longest ORF analysis with explicit frame-aware codon logic</w:t>
       </w:r>
     </w:p>
     <w:p>
@@ -997,7 +992,7 @@
         <w:spacing w:after="40"/>
       </w:pPr>
       <w:r>
-        <w:t>Molecular-weight / pI-related protein analysis</w:t>
+        <w:t>Molecular weight and theoretical pI using the Peptides package</w:t>
       </w:r>
     </w:p>
     <w:p>
@@ -1211,7 +1206,7 @@
     </w:p>
     <w:p>
       <w:r>
-        <w:t>There was no p3 object. The final combined figure used the existing plot objects p1, p2, p4, p5 and p6.</w:t>
+        <w:t>There is intentionally no p3 object. The final combined figure uses p1, p2, p4, p5 and p6, and the plots are saved only after all plot objects are created.</w:t>
       </w:r>
     </w:p>
     <w:p>
@@ -1221,12 +1216,12 @@
     </w:p>
     <w:p>
       <w:r>
-        <w:t>Additional interactive Plotly objects included: plotly_aa, plotly_gc, plotly_gc_at, plotly_heatmap, plotly_nucleotide, plotly_orf</w:t>
+        <w:t>The cleaned R script no longer creates unused interactive Plotly objects; the repository retains the previously generated Linux interactive conservation HTML.</w:t>
       </w:r>
     </w:p>
     <w:p>
       <w:r>
-        <w:t>R result file: TP53_R_results.txt</w:t>
+        <w:t>R output: Results/R/TP53_R_results.txt</w:t>
       </w:r>
     </w:p>
     <w:p>
@@ -1598,7 +1593,7 @@
     </w:tbl>
     <w:p>
       <w:r>
-        <w:t>These independent sequence checks support that the analyzed protein and CDS correspond to the intended human TP53 reference sequences.</w:t>
+        <w:t>The cleaned Python, Linux and R workflows resolve the repository structure without depending on a particular working directory. Python and R regenerate their own outputs; the Linux entry point regenerates deterministic validation outputs under Results/Linux/Reproduced/ and records software/input checksums in run_manifest.txt.</w:t>
       </w:r>
     </w:p>
     <w:p>
@@ -1834,7 +1829,7 @@
     </w:tbl>
     <w:p>
       <w:r>
-        <w:t>The Linux results therefore independently confirmed the identity of the analyzed sequence as human TP53 and showed strong conservation among the compared related proteins.</w:t>
+        <w:t>The recorded Linux BLAST results show strong conservation among the listed related proteins. BLASTP depends on the external database and query date, so the repository preserves the recorded result rather than claiming it is a fresh reproducible local computation. A fresh BLASTP run should be treated as a new external result.</w:t>
       </w:r>
     </w:p>
     <w:p>
@@ -2512,7 +2507,7 @@
     </w:tbl>
     <w:p>
       <w:r>
-        <w:t>Mutation hotspot positions recorded: 175 (R), 245 (G), 248 (R), 249 (R), 273 (R), 282 (R).</w:t>
+        <w:t>Mutation hotspot positions recorded in the original Linux analysis: 175 (R), 245 (G), 248 (R), 249 (R), 273 (R), 282 (R). These are mapped positions, not frequencies derived from a mutation dataset in this repository.</w:t>
       </w:r>
     </w:p>
     <w:p>
@@ -2816,7 +2811,7 @@
     </w:tbl>
     <w:p>
       <w:r>
-        <w:t>The project’s final Linux summary records the protein as having a slightly acidic theoretical pI, an instability-index prediction of unstable, a negative GRAVY value indicating an overall hydrophilic character, and aromatic residues at approximately 6.11%.</w:t>
+        <w:t>The recorded Linux summary reports molecular weight 43652.71 Da, theoretical pI 6.33, instability index 73.59, GRAVY -0.7562 and aromaticity 0.0611 using the stated analysis method.</w:t>
       </w:r>
     </w:p>
     <w:p>
@@ -3442,7 +3437,7 @@
     </w:tbl>
     <w:p>
       <w:r>
-        <w:t>The uploaded Final Project contains 61 archive entries, including the above project components and their files.</w:t>
+        <w:t>The cleaned project contains the code, data, documentation, plots, results, dependency lists and reproducible entry points. Historical Linux results are preserved separately from regenerated deterministic checks.</w:t>
       </w:r>
     </w:p>
     <w:p>
@@ -3460,12 +3455,12 @@
     </w:p>
     <w:p>
       <w:r>
-        <w:t>The TP53 sequence analyzed in this project was consistently identified as human TP53. The CDS is 1182 nt and matches NCBI NM_000546.6 exactly. The corresponding protein is 393 aa and matches UniProt P04637 exactly. BLASTP independently produced a 100% identical human TP53 hit over the full 393-aa sequence.</w:t>
+        <w:t>The TP53 sequence analyzed in this project was consistently identified as human TP53. The CDS is 1182 nt and matches the annotated region of NCBI NM_000546.6 exactly. The corresponding protein is 393 aa after removing the terminal stop symbol and matches UniProt P04637 exactly. The recorded BLASTP result shows a 100% identical human TP53 hit over the full 393-aa sequence.</w:t>
       </w:r>
     </w:p>
     <w:p>
       <w:r>
-        <w:t>The combined Python, Linux and R analyses provide sequence, nucleotide, codon, ORF, protein, physicochemical, motif, similarity, conservation, validation and visualization information for the same TP53 Homo sapiens sequence.</w:t>
+        <w:t>The combined Python, Linux and R analyses provide sequence, nucleotide, codon, ORF/frame, protein, physicochemical, motif, similarity, conservation, validation and visualization information. Sequence-pattern observations such as N-X-S/T or S/T-P motifs are not treated as experimental evidence of biological modification.</w:t>
       </w:r>
     </w:p>
     <w:p>
@@ -3506,6 +3501,11 @@
       </w:pPr>
       <w:r>
         <w:t>UniProt: P04637 (P53_HUMAN)</w:t>
+      </w:r>
+    </w:p>
+    <w:p>
+      <w:r>
+        <w:t>Reproducibility note: Python and R scripts resolve the repository Data/Results/Plots structure independently of the caller's working directory. The Linux script does the same and writes deterministic checks to Results/Linux/Reproduced/. It does not overwrite historical Linux results, and its run_manifest.txt records Python/Biopython versions and SHA256 checksums of the inputs and reproduced outputs. BLASTP remains an external database-dependent recorded result.</w:t>
       </w:r>
     </w:p>
     <w:sectPr>

</xml_diff>